<commit_message>
Fact-check fixes, contribution statement, refreshed dashboard
- Correct figures found in a fact-check: stuck sensor ran 16 days
  (24 Aug - 8 Sep 2019), Shillong reading 918 ug/m3, hourly files 285 MB,
  Model B pre-lockdown R2 0.67, fact table 61 columns
- Rename the data-quality KPI to "Days with bad PM data" and re-save the
  pbix and its PDF export
- Add docs/contribution_statement.txt and update the report and deck
  contribution sections
- Re-run the notebook end to end (0 errors)

Co-Authored-By: Claude Opus 5.5 <noreply@anthropic.com>
</commit_message>
<xml_diff>
--- a/docs/report/Breathe_India_report.docx
+++ b/docs/report/Breathe_India_report.docx
@@ -1025,7 +1025,7 @@
           <w:color w:val="1A1A1A"/>
           <w:sz w:val="20"/>
         </w:rPr>
-        <w:t xml:space="preserve"> Kaggle's public dataset endpoint, which needs no login (the browser button does). Only the three daily files are kept; the 286 MB of hourly files are not needed.</w:t>
+        <w:t xml:space="preserve"> Kaggle's public dataset endpoint, which needs no login (the browser button does). Only the three daily files are kept; the 285 MB of hourly files are not needed.</w:t>
       </w:r>
     </w:p>
     <w:p>
@@ -1508,7 +1508,7 @@
                 <w:color w:val="1A1A1A"/>
                 <w:sz w:val="17"/>
               </w:rPr>
-              <w:t>55% fell in the monsoon, including 917 µg/m³ in Shillong, the cleanest city</w:t>
+              <w:t>55% fell in the monsoon, including 918 µg/m³ in Shillong, the cleanest city</w:t>
             </w:r>
           </w:p>
         </w:tc>
@@ -1904,7 +1904,7 @@
           <w:color w:val="1A1A1A"/>
           <w:sz w:val="20"/>
         </w:rPr>
-        <w:t xml:space="preserve"> a city-day fact table (28,260 rows × 62 columns) with city, date and station dimensions. Every join declares its cardinality, so a duplicated key stops the notebook instead of silently multiplying rows.</w:t>
+        <w:t xml:space="preserve"> a city-day fact table (28,260 rows × 61 columns) with city, date and station dimensions. Every join declares its cardinality, so a duplicated key stops the notebook instead of silently multiplying rows.</w:t>
       </w:r>
     </w:p>
     <w:p>
@@ -2786,7 +2786,7 @@
           <w:color w:val="1A1A1A"/>
           <w:sz w:val="20"/>
         </w:rPr>
-        <w:t>Gradient Boosting has the best macro F1, which weights all six categories equally, and 99.7% of its errors are one category away. Its value is on days the air changes, which the baseline gets wrong by definition. It also fails honestly: in cross-validation on 2015–18 it only matched the baseline (macro F1 0.62 each), and during the lockdown its macro F1 fell to 0.59, below the baseline's 0.65, because the rules it learned stopped applying.</w:t>
+        <w:t>Gradient Boosting has the best macro F1, which weights all six categories equally, and 99.7% of its predictions are right or one category off. Its value is on days the air changes, which the baseline gets wrong by definition. It also fails honestly: in cross-validation on 2015–18 it only matched the baseline (macro F1 0.62 each), and during the lockdown its macro F1 fell to 0.59, below the baseline's 0.65, because the rules it learned stopped applying.</w:t>
       </w:r>
     </w:p>
     <w:p>
@@ -2967,7 +2967,7 @@
                 <w:color w:val="1A1A1A"/>
                 <w:sz w:val="17"/>
               </w:rPr>
-              <w:t>R² 0.64, bias +4%: it tracked reality up to the lockdown</w:t>
+              <w:t>R² 0.67, bias +4%: it tracked reality up to the lockdown</w:t>
             </w:r>
           </w:p>
         </w:tc>
@@ -4492,7 +4492,7 @@
                 <w:color w:val="1A1A1A"/>
                 <w:sz w:val="17"/>
               </w:rPr>
-              <w:t>Data extraction (Kaggle download, Open-Meteo APIs), cleaning and the cleaning log, SQLite and Parquet loading, data-quality page</w:t>
+              <w:t>Transformation and feature engineering, the three machine-learning models, the Power BI dashboard</w:t>
             </w:r>
           </w:p>
         </w:tc>
@@ -4534,7 +4534,7 @@
                 <w:color w:val="1A1A1A"/>
                 <w:sz w:val="17"/>
               </w:rPr>
-              <w:t>Transformation and feature engineering, the three machine-learning models, Power BI dashboard</w:t>
+              <w:t>Data extraction (Kaggle download, Open-Meteo APIs), cleaning and the cleaning log, SQLite and Parquet storage</w:t>
             </w:r>
           </w:p>
         </w:tc>

</xml_diff>